<commit_message>
Kim12-2-11-Fonksiyonel-Grup-Izomerligi: gorsel alanlarina Shutter onizlemeleri yerlestirildi (2.3 bicimi)
</commit_message>
<xml_diff>
--- a/Kim12-2-11-Fonksiyonel-Grup-Izomerligi.docx
+++ b/Kim12-2-11-Fonksiyonel-Grup-Izomerligi.docx
@@ -114,99 +114,73 @@
         <w:t xml:space="preserve">’dir (Görsel B). Peki aynı sayıda ve aynı türde atomdan oluşan bu moleküller nasıl bu kadar farklı özellikler gösterebilir? Bu moleküllerde atomlar nasıl düzenlenmiştir? Bu düzenlemeleri gösteren bir model nasıl oluşturulabilir? Bu soruların cevabını bir etkinlik yaparak keşfediniz. Analiz ve Keşif Atölyesi 2.11.’de bilimsel model oluşturacaksınız: Kapalı formülleri aynı olan bileşikleri gruplandıracak, bu bileşikler için önce çizimle, sonra farklı malzemelerle modeller önerecek ve modellerinizi bilim insanlarının modelleriyle karşılaştırarak yeni kanıtlar ışığında yenileyeceksiniz. Modellerinizi tartışırken düşüncelerinizi açıkça ifade edecek, grup arkadaşlarınızla iş birliği içinde çalışacaksınız. Bilgileri eleştirel bir bakışla değerlendirecek, güvenilir kaynaklara başvurarak araştırmacı ve sorgulayıcı bir tutum sergileyeceksiniz.</w:t>
       </w:r>
     </w:p>
-    <w:tbl>
-      <w:tblPr>
-        <w:tblW w:w="9000" w:type="dxa"/>
+    <w:p>
+      <w:pPr>
         <w:jc w:val="center"/>
-        <w:tblBorders>
-          <w:top w:val="single" w:sz="8" w:space="0" w:color="7F7F7F"/>
-          <w:left w:val="single" w:sz="8" w:space="0" w:color="7F7F7F"/>
-          <w:bottom w:val="single" w:sz="8" w:space="0" w:color="7F7F7F"/>
-          <w:right w:val="single" w:sz="8" w:space="0" w:color="7F7F7F"/>
-        </w:tblBorders>
-      </w:tblPr>
-      <w:tblGrid>
-        <w:gridCol w:w="9000"/>
-      </w:tblGrid>
-      <w:tr>
-        <w:tc>
-          <w:tcPr>
-            <w:tcW w:w="9000" w:type="dxa"/>
-            <w:shd w:val="clear" w:color="auto" w:fill="EDEDED"/>
-          </w:tcPr>
-          <w:p>
-            <w:pPr>
-              <w:jc w:val="both"/>
-              <w:rPr>
-                <w:rFonts w:ascii="Times New Roman" w:hAnsi="Times New Roman" w:cs="Times New Roman"/>
-                <w:lang w:val="tr-TR"/>
-              </w:rPr>
-            </w:pPr>
-            <w:r>
-              <w:rPr>
-                <w:rFonts w:ascii="Times New Roman" w:hAnsi="Times New Roman" w:cs="Times New Roman"/>
-                <w:lang w:val="tr-TR"/>
-              </w:rPr>
-              <w:t xml:space="preserve">GÖRSEL ALANI (Shutterstock)</w:t>
-            </w:r>
-          </w:p>
-          <w:p>
-            <w:pPr>
-              <w:jc w:val="both"/>
-              <w:rPr>
-                <w:rFonts w:ascii="Times New Roman" w:hAnsi="Times New Roman" w:cs="Times New Roman"/>
-                <w:lang w:val="tr-TR"/>
-              </w:rPr>
-            </w:pPr>
-            <w:r>
-              <w:rPr>
-                <w:rFonts w:ascii="Times New Roman" w:hAnsi="Times New Roman" w:cs="Times New Roman"/>
-                <w:lang w:val="tr-TR"/>
-              </w:rPr>
-              <w:t xml:space="preserve">Tarif: Cam şişede kolonya ile yanında bir sprey kutusu (saç spreyi ya da oda spreyi); marka ve logo görünmesin.</w:t>
-            </w:r>
-          </w:p>
-          <w:p>
-            <w:pPr>
-              <w:jc w:val="both"/>
-              <w:rPr>
-                <w:rFonts w:ascii="Times New Roman" w:hAnsi="Times New Roman" w:cs="Times New Roman"/>
-                <w:lang w:val="tr-TR"/>
-              </w:rPr>
-            </w:pPr>
-            <w:r>
-              <w:rPr>
-                <w:rFonts w:ascii="Times New Roman" w:hAnsi="Times New Roman" w:cs="Times New Roman"/>
-                <w:lang w:val="tr-TR"/>
-              </w:rPr>
-              <w:t xml:space="preserve">Shutter ID: 144344515 (fotoğraf) — Close-up of an aerosol can</w:t>
-            </w:r>
-          </w:p>
-        </w:tc>
-      </w:tr>
-    </w:tbl>
-    <w:p>
-      <w:pPr>
-        <w:jc w:val="both"/>
-        <w:rPr>
-          <w:rFonts w:ascii="Times New Roman" w:hAnsi="Times New Roman" w:cs="Times New Roman"/>
-          <w:lang w:val="tr-TR"/>
-        </w:rPr>
-      </w:pPr>
+      </w:pPr>
+      <w:r>
+        <w:drawing>
+          <wp:inline xmlns:a="http://schemas.openxmlformats.org/drawingml/2006/main" xmlns:pic="http://schemas.openxmlformats.org/drawingml/2006/picture">
+            <wp:extent cx="1581300" cy="2520000"/>
+            <wp:docPr id="900010" name="Picture 900010"/>
+            <wp:cNvGraphicFramePr>
+              <a:graphicFrameLocks noChangeAspect="1"/>
+            </wp:cNvGraphicFramePr>
+            <a:graphic>
+              <a:graphicData uri="http://schemas.openxmlformats.org/drawingml/2006/picture">
+                <pic:pic>
+                  <pic:nvPicPr>
+                    <pic:cNvPr id="0" name="144344515_d.jpg"/>
+                    <pic:cNvPicPr/>
+                  </pic:nvPicPr>
+                  <pic:blipFill>
+                    <a:blip r:embed="rId11"/>
+                    <a:stretch>
+                      <a:fillRect/>
+                    </a:stretch>
+                  </pic:blipFill>
+                  <pic:spPr>
+                    <a:xfrm>
+                      <a:off x="0" y="0"/>
+                      <a:ext cx="1581300" cy="2520000"/>
+                    </a:xfrm>
+                    <a:prstGeom prst="rect"/>
+                  </pic:spPr>
+                </pic:pic>
+              </a:graphicData>
+            </a:graphic>
+          </wp:inline>
+        </w:drawing>
+      </w:r>
     </w:p>
     <w:p>
       <w:pPr>
         <w:jc w:val="center"/>
-        <w:rPr>
-          <w:rFonts w:ascii="Times New Roman" w:hAnsi="Times New Roman" w:cs="Times New Roman"/>
-          <w:lang w:val="tr-TR"/>
-        </w:rPr>
       </w:pPr>
       <w:r>
         <w:rPr>
           <w:rFonts w:ascii="Times New Roman" w:hAnsi="Times New Roman" w:cs="Times New Roman"/>
           <w:b/>
           <w:bCs/>
+          <w:highlight w:val="yellow"/>
+          <w:lang w:val="tr-TR"/>
+        </w:rPr>
+        <w:t xml:space="preserve">Shutter id: 144344515</w:t>
+      </w:r>
+    </w:p>
+    <w:p>
+      <w:pPr>
+        <w:jc w:val="center"/>
+        <w:rPr>
+          <w:rFonts w:ascii="Times New Roman" w:hAnsi="Times New Roman" w:cs="Times New Roman"/>
+          <w:lang w:val="tr-TR"/>
+        </w:rPr>
+      </w:pPr>
+      <w:r>
+        <w:rPr>
+          <w:rFonts w:ascii="Times New Roman" w:hAnsi="Times New Roman" w:cs="Times New Roman"/>
+          <w:b/>
+          <w:bCs/>
           <w:lang w:val="tr-TR"/>
         </w:rPr>
         <w:t xml:space="preserve">Görsel A:</w:t>
@@ -219,85 +193,59 @@
         <w:t xml:space="preserve"> Kolonya ve sprey</w:t>
       </w:r>
     </w:p>
-    <w:tbl>
-      <w:tblPr>
-        <w:tblW w:w="9000" w:type="dxa"/>
+    <w:p>
+      <w:pPr>
         <w:jc w:val="center"/>
-        <w:tblBorders>
-          <w:top w:val="single" w:sz="8" w:space="0" w:color="7F7F7F"/>
-          <w:left w:val="single" w:sz="8" w:space="0" w:color="7F7F7F"/>
-          <w:bottom w:val="single" w:sz="8" w:space="0" w:color="7F7F7F"/>
-          <w:right w:val="single" w:sz="8" w:space="0" w:color="7F7F7F"/>
-        </w:tblBorders>
-      </w:tblPr>
-      <w:tblGrid>
-        <w:gridCol w:w="9000"/>
-      </w:tblGrid>
-      <w:tr>
-        <w:tc>
-          <w:tcPr>
-            <w:tcW w:w="9000" w:type="dxa"/>
-            <w:shd w:val="clear" w:color="auto" w:fill="EDEDED"/>
-          </w:tcPr>
-          <w:p>
-            <w:pPr>
-              <w:jc w:val="both"/>
-              <w:rPr>
-                <w:rFonts w:ascii="Times New Roman" w:hAnsi="Times New Roman" w:cs="Times New Roman"/>
-                <w:lang w:val="tr-TR"/>
-              </w:rPr>
-            </w:pPr>
-            <w:r>
-              <w:rPr>
-                <w:rFonts w:ascii="Times New Roman" w:hAnsi="Times New Roman" w:cs="Times New Roman"/>
-                <w:lang w:val="tr-TR"/>
-              </w:rPr>
-              <w:t xml:space="preserve">GÖRSEL ALANI (Shutterstock)</w:t>
-            </w:r>
-          </w:p>
-          <w:p>
-            <w:pPr>
-              <w:jc w:val="both"/>
-              <w:rPr>
-                <w:rFonts w:ascii="Times New Roman" w:hAnsi="Times New Roman" w:cs="Times New Roman"/>
-                <w:lang w:val="tr-TR"/>
-              </w:rPr>
-            </w:pPr>
-            <w:r>
-              <w:rPr>
-                <w:rFonts w:ascii="Times New Roman" w:hAnsi="Times New Roman" w:cs="Times New Roman"/>
-                <w:lang w:val="tr-TR"/>
-              </w:rPr>
-              <w:t xml:space="preserve">Tarif: Cam şişede elma ya da üzüm sirkesi ve küçük bir kâsede sirke; marka ve logo görünmesin.</w:t>
-            </w:r>
-          </w:p>
-          <w:p>
-            <w:pPr>
-              <w:jc w:val="both"/>
-              <w:rPr>
-                <w:rFonts w:ascii="Times New Roman" w:hAnsi="Times New Roman" w:cs="Times New Roman"/>
-                <w:lang w:val="tr-TR"/>
-              </w:rPr>
-            </w:pPr>
-            <w:r>
-              <w:rPr>
-                <w:rFonts w:ascii="Times New Roman" w:hAnsi="Times New Roman" w:cs="Times New Roman"/>
-                <w:lang w:val="tr-TR"/>
-              </w:rPr>
-              <w:t xml:space="preserve">Shutter ID: 2485328929 (fotoğraf) — Vinegar in glass bottles and bowl</w:t>
-            </w:r>
-          </w:p>
-        </w:tc>
-      </w:tr>
-    </w:tbl>
+      </w:pPr>
+      <w:r>
+        <w:drawing>
+          <wp:inline xmlns:a="http://schemas.openxmlformats.org/drawingml/2006/main" xmlns:pic="http://schemas.openxmlformats.org/drawingml/2006/picture">
+            <wp:extent cx="3953974" cy="2519999"/>
+            <wp:docPr id="900011" name="Picture 900011"/>
+            <wp:cNvGraphicFramePr>
+              <a:graphicFrameLocks noChangeAspect="1"/>
+            </wp:cNvGraphicFramePr>
+            <a:graphic>
+              <a:graphicData uri="http://schemas.openxmlformats.org/drawingml/2006/picture">
+                <pic:pic>
+                  <pic:nvPicPr>
+                    <pic:cNvPr id="0" name="2485328929_d.jpg"/>
+                    <pic:cNvPicPr/>
+                  </pic:nvPicPr>
+                  <pic:blipFill>
+                    <a:blip r:embed="rId12"/>
+                    <a:stretch>
+                      <a:fillRect/>
+                    </a:stretch>
+                  </pic:blipFill>
+                  <pic:spPr>
+                    <a:xfrm>
+                      <a:off x="0" y="0"/>
+                      <a:ext cx="3953974" cy="2519999"/>
+                    </a:xfrm>
+                    <a:prstGeom prst="rect"/>
+                  </pic:spPr>
+                </pic:pic>
+              </a:graphicData>
+            </a:graphic>
+          </wp:inline>
+        </w:drawing>
+      </w:r>
+    </w:p>
     <w:p>
       <w:pPr>
-        <w:jc w:val="both"/>
-        <w:rPr>
-          <w:rFonts w:ascii="Times New Roman" w:hAnsi="Times New Roman" w:cs="Times New Roman"/>
-          <w:lang w:val="tr-TR"/>
-        </w:rPr>
-      </w:pPr>
+        <w:jc w:val="center"/>
+      </w:pPr>
+      <w:r>
+        <w:rPr>
+          <w:rFonts w:ascii="Times New Roman" w:hAnsi="Times New Roman" w:cs="Times New Roman"/>
+          <w:b/>
+          <w:bCs/>
+          <w:highlight w:val="yellow"/>
+          <w:lang w:val="tr-TR"/>
+        </w:rPr>
+        <w:t xml:space="preserve">Shutter id: 2485328929</w:t>
+      </w:r>
     </w:p>
     <w:p>
       <w:pPr>

</xml_diff>